<commit_message>
Expand PTS-2 annexures into editable templates
Co-authored-by: Delroy Martins <delrockz@users.noreply.github.com>
</commit_message>
<xml_diff>
--- a/deliverables/PTS-2_Buddhist_Circuit_Marketing_Project.docx
+++ b/deliverables/PTS-2_Buddhist_Circuit_Marketing_Project.docx
@@ -1975,7 +1975,357 @@
           <w:b w:val="0"/>
           <w:sz w:val="24"/>
         </w:rPr>
-        <w:t>Annexure A: Tourist Survey Instrument (Marketing Focus) Annexure B: Stakeholder Interview Schedule (Travel Trade and Local Service Providers) Annexure C: Digital Audit Checklist (Search, Maps, Social, Content Quality) Annexure D: Sample One-Month Content Calendar Annexure E: Proposed KPI Dashboard Template</w:t>
+        <w:t>Annexure A: Tourist Survey Instrument (Marketing Focus) - Blank Format</w:t>
+      </w:r>
+    </w:p>
+    <w:p>
+      <w:pPr>
+        <w:spacing w:line="360" w:lineRule="auto" w:after="160"/>
+        <w:jc w:val="both"/>
+      </w:pPr>
+      <w:r>
+        <w:rPr>
+          <w:rFonts w:ascii="Times New Roman" w:hAnsi="Times New Roman"/>
+          <w:b w:val="0"/>
+          <w:sz w:val="24"/>
+        </w:rPr>
+        <w:t>A1. Respondent Profile 1. Date of interaction: ____________________ 2. Place of interaction: ____________________ 3. Age group: 18-25 / 26-35 / 36-45 / 46-60 / 60+ 4. Gender (optional): ____________________ 5. Place of origin: ____________________ 6. Visit type: First visit / Repeat visit 7. Travel type: Solo / Family / Friends / Group / Pilgrimage group</w:t>
+      </w:r>
+    </w:p>
+    <w:p>
+      <w:pPr>
+        <w:spacing w:line="360" w:lineRule="auto" w:after="160"/>
+        <w:jc w:val="both"/>
+      </w:pPr>
+      <w:r>
+        <w:rPr>
+          <w:rFonts w:ascii="Times New Roman" w:hAnsi="Times New Roman"/>
+          <w:b w:val="0"/>
+          <w:sz w:val="24"/>
+        </w:rPr>
+        <w:t>A2. Awareness and Discovery 1. How did you hear about this monastery / route? Social media / Search engine / Friend or relative / Tour operator / En route discovery / Other 2. Before this trip, were you aware of a Buddhist trail in the Siliguri region? Yes / No / Not sure 3. Which nearby monasteries or sites do you know? ____________________</w:t>
+      </w:r>
+    </w:p>
+    <w:p>
+      <w:pPr>
+        <w:spacing w:line="360" w:lineRule="auto" w:after="160"/>
+        <w:jc w:val="both"/>
+      </w:pPr>
+      <w:r>
+        <w:rPr>
+          <w:rFonts w:ascii="Times New Roman" w:hAnsi="Times New Roman"/>
+          <w:b w:val="0"/>
+          <w:sz w:val="24"/>
+        </w:rPr>
+        <w:t>A3. Experience and Marketing Communication 1. Rate clarity of available information before visit (1 very poor - 5 excellent): ____ 2. Rate signage and wayfinding at destination (1-5): ____ 3. Rate overall atmosphere and visitor comfort (1-5): ____ 4. Was respectful visitor guidance visible and helpful? Yes / No / Partly 5. Would you recommend this destination to others? Yes / No / Maybe</w:t>
+      </w:r>
+    </w:p>
+    <w:p>
+      <w:pPr>
+        <w:spacing w:line="360" w:lineRule="auto" w:after="160"/>
+        <w:jc w:val="both"/>
+      </w:pPr>
+      <w:r>
+        <w:rPr>
+          <w:rFonts w:ascii="Times New Roman" w:hAnsi="Times New Roman"/>
+          <w:b w:val="0"/>
+          <w:sz w:val="24"/>
+        </w:rPr>
+        <w:t>A4. Intention and Suggestions 1. Would you choose a curated half-day/full-day Buddhist circuit if available? Yes / No / Maybe 2. Preferred communication language(s): ____________________ 3. What one improvement would increase your satisfaction? ____________________</w:t>
+      </w:r>
+    </w:p>
+    <w:p>
+      <w:pPr>
+        <w:spacing w:line="360" w:lineRule="auto" w:after="160"/>
+        <w:jc w:val="both"/>
+      </w:pPr>
+      <w:r>
+        <w:rPr>
+          <w:rFonts w:ascii="Times New Roman" w:hAnsi="Times New Roman"/>
+          <w:b w:val="0"/>
+          <w:sz w:val="24"/>
+        </w:rPr>
+        <w:t>Annexure B: Stakeholder Interview Schedule - Blank Format (For tour operators, hotel/travel desk staff, transport providers, local businesses, facilitators)</w:t>
+      </w:r>
+    </w:p>
+    <w:p>
+      <w:pPr>
+        <w:spacing w:line="360" w:lineRule="auto" w:after="160"/>
+        <w:jc w:val="both"/>
+      </w:pPr>
+      <w:r>
+        <w:rPr>
+          <w:rFonts w:ascii="Times New Roman" w:hAnsi="Times New Roman"/>
+          <w:b w:val="0"/>
+          <w:sz w:val="24"/>
+        </w:rPr>
+        <w:t>B1. Respondent details 1. Name/role (optional): ____________________ 2. Organization/business type: ____________________ 3. Location: ____________________ 4. Years of experience: ____________________</w:t>
+      </w:r>
+    </w:p>
+    <w:p>
+      <w:pPr>
+        <w:spacing w:line="360" w:lineRule="auto" w:after="160"/>
+        <w:jc w:val="both"/>
+      </w:pPr>
+      <w:r>
+        <w:rPr>
+          <w:rFonts w:ascii="Times New Roman" w:hAnsi="Times New Roman"/>
+          <w:b w:val="0"/>
+          <w:sz w:val="24"/>
+        </w:rPr>
+        <w:t>B2. Thematic prompts 1. How is demand for Buddhist-site visitation changing in recent years? 2. Which customer segments ask for monastery-related visits? 3. What are the biggest barriers in packaging this as a circuit product? 4. Which channels currently work best for inquiries and conversions? 5. What information do visitors usually ask for but fail to find? 6. What partnerships are needed for better marketing coordination? 7. How can promotion remain respectful to sacred norms? 8. What quick interventions could improve conversion and visitor quality?</w:t>
+      </w:r>
+    </w:p>
+    <w:p>
+      <w:pPr>
+        <w:spacing w:line="360" w:lineRule="auto" w:after="160"/>
+        <w:jc w:val="both"/>
+      </w:pPr>
+      <w:r>
+        <w:rPr>
+          <w:rFonts w:ascii="Times New Roman" w:hAnsi="Times New Roman"/>
+          <w:b w:val="0"/>
+          <w:sz w:val="24"/>
+        </w:rPr>
+        <w:t>B3. Closing notes - Key quote(s): ____________________ - Researcher observation: ____________________</w:t>
+      </w:r>
+    </w:p>
+    <w:p>
+      <w:pPr>
+        <w:spacing w:line="360" w:lineRule="auto" w:after="160"/>
+        <w:jc w:val="both"/>
+      </w:pPr>
+      <w:r>
+        <w:rPr>
+          <w:rFonts w:ascii="Times New Roman" w:hAnsi="Times New Roman"/>
+          <w:b w:val="0"/>
+          <w:sz w:val="24"/>
+        </w:rPr>
+        <w:t>Annexure C: Digital Audit Checklist - Blank Format (For site-level communication quality review)</w:t>
+      </w:r>
+    </w:p>
+    <w:p>
+      <w:pPr>
+        <w:spacing w:line="360" w:lineRule="auto" w:after="160"/>
+        <w:jc w:val="both"/>
+      </w:pPr>
+      <w:r>
+        <w:rPr>
+          <w:rFonts w:ascii="Times New Roman" w:hAnsi="Times New Roman"/>
+          <w:b w:val="0"/>
+          <w:sz w:val="24"/>
+        </w:rPr>
+        <w:t>C1. Search and discoverability - Destination appears on first page for relevant queries: Yes / No / Partly - Correct location metadata available: Yes / No - Opening hours/contact clarity: Yes / No / Partly</w:t>
+      </w:r>
+    </w:p>
+    <w:p>
+      <w:pPr>
+        <w:spacing w:line="360" w:lineRule="auto" w:after="160"/>
+        <w:jc w:val="both"/>
+      </w:pPr>
+      <w:r>
+        <w:rPr>
+          <w:rFonts w:ascii="Times New Roman" w:hAnsi="Times New Roman"/>
+          <w:b w:val="0"/>
+          <w:sz w:val="24"/>
+        </w:rPr>
+        <w:t>C2. Maps and listing quality - Map pin accuracy: Good / Average / Poor - Category labels and naming consistency: Good / Average / Poor - Basic photos and description quality: Good / Average / Poor</w:t>
+      </w:r>
+    </w:p>
+    <w:p>
+      <w:pPr>
+        <w:spacing w:line="360" w:lineRule="auto" w:after="160"/>
+        <w:jc w:val="both"/>
+      </w:pPr>
+      <w:r>
+        <w:rPr>
+          <w:rFonts w:ascii="Times New Roman" w:hAnsi="Times New Roman"/>
+          <w:b w:val="0"/>
+          <w:sz w:val="24"/>
+        </w:rPr>
+        <w:t>C3. Social and content quality - Consistency of message across channels: High / Medium / Low - Use of respectful visitor guidance in content: Yes / No - Festival/event communication clarity: High / Medium / Low - Multilingual communication presence: High / Medium / Low</w:t>
+      </w:r>
+    </w:p>
+    <w:p>
+      <w:pPr>
+        <w:spacing w:line="360" w:lineRule="auto" w:after="160"/>
+        <w:jc w:val="both"/>
+      </w:pPr>
+      <w:r>
+        <w:rPr>
+          <w:rFonts w:ascii="Times New Roman" w:hAnsi="Times New Roman"/>
+          <w:b w:val="0"/>
+          <w:sz w:val="24"/>
+        </w:rPr>
+        <w:t>C4. Overall audit score template - Discoverability score (out of 10): ____ - Conversion-readiness score (out of 10): ____ - Responsible messaging score (out of 10): ____ - Priority fixes (top 3): ____________________</w:t>
+      </w:r>
+    </w:p>
+    <w:p>
+      <w:pPr>
+        <w:spacing w:line="360" w:lineRule="auto" w:after="160"/>
+        <w:jc w:val="both"/>
+      </w:pPr>
+      <w:r>
+        <w:rPr>
+          <w:rFonts w:ascii="Times New Roman" w:hAnsi="Times New Roman"/>
+          <w:b w:val="0"/>
+          <w:sz w:val="24"/>
+        </w:rPr>
+        <w:t>Annexure D: One-Month Content Calendar - Editable Template</w:t>
+      </w:r>
+    </w:p>
+    <w:p>
+      <w:pPr>
+        <w:spacing w:line="360" w:lineRule="auto" w:after="160"/>
+        <w:jc w:val="both"/>
+      </w:pPr>
+      <w:r>
+        <w:rPr>
+          <w:rFonts w:ascii="Times New Roman" w:hAnsi="Times New Roman"/>
+          <w:b w:val="0"/>
+          <w:sz w:val="24"/>
+        </w:rPr>
+        <w:t>Week 1: - Post 1 (Awareness): ____________________ - Post 2 (Etiquette / Respectful visit): ____________________ - Post 3 (Route clarity / how to reach): ____________________</w:t>
+      </w:r>
+    </w:p>
+    <w:p>
+      <w:pPr>
+        <w:spacing w:line="360" w:lineRule="auto" w:after="160"/>
+        <w:jc w:val="both"/>
+      </w:pPr>
+      <w:r>
+        <w:rPr>
+          <w:rFonts w:ascii="Times New Roman" w:hAnsi="Times New Roman"/>
+          <w:b w:val="0"/>
+          <w:sz w:val="24"/>
+        </w:rPr>
+        <w:t>Week 2: - Post 1 (Sacred story / heritage context): ____________________ - Post 2 (Nearby monastery connector): ____________________ - Post 3 (Visitor FAQ): ____________________</w:t>
+      </w:r>
+    </w:p>
+    <w:p>
+      <w:pPr>
+        <w:spacing w:line="360" w:lineRule="auto" w:after="160"/>
+        <w:jc w:val="both"/>
+      </w:pPr>
+      <w:r>
+        <w:rPr>
+          <w:rFonts w:ascii="Times New Roman" w:hAnsi="Times New Roman"/>
+          <w:b w:val="0"/>
+          <w:sz w:val="24"/>
+        </w:rPr>
+        <w:t>Week 3: - Post 1 (Local voice/community angle): ____________________ - Post 2 (Festival/event information): ____________________ - Post 3 (Responsible travel reminder): ____________________</w:t>
+      </w:r>
+    </w:p>
+    <w:p>
+      <w:pPr>
+        <w:spacing w:line="360" w:lineRule="auto" w:after="160"/>
+        <w:jc w:val="both"/>
+      </w:pPr>
+      <w:r>
+        <w:rPr>
+          <w:rFonts w:ascii="Times New Roman" w:hAnsi="Times New Roman"/>
+          <w:b w:val="0"/>
+          <w:sz w:val="24"/>
+        </w:rPr>
+        <w:t>Week 4: - Post 1 (Itinerary suggestion): ____________________ - Post 2 (User-generated testimonial curation): ____________________ - Post 3 (Next-month teaser): ____________________</w:t>
+      </w:r>
+    </w:p>
+    <w:p>
+      <w:pPr>
+        <w:spacing w:line="360" w:lineRule="auto" w:after="160"/>
+        <w:jc w:val="both"/>
+      </w:pPr>
+      <w:r>
+        <w:rPr>
+          <w:rFonts w:ascii="Times New Roman" w:hAnsi="Times New Roman"/>
+          <w:b w:val="0"/>
+          <w:sz w:val="24"/>
+        </w:rPr>
+        <w:t>Metrics to track each week: Reach / Engagement / Inquiry / Itinerary click / Sentiment note</w:t>
+      </w:r>
+    </w:p>
+    <w:p>
+      <w:pPr>
+        <w:spacing w:line="360" w:lineRule="auto" w:after="160"/>
+        <w:jc w:val="both"/>
+      </w:pPr>
+      <w:r>
+        <w:rPr>
+          <w:rFonts w:ascii="Times New Roman" w:hAnsi="Times New Roman"/>
+          <w:b w:val="0"/>
+          <w:sz w:val="24"/>
+        </w:rPr>
+        <w:t>Annexure E: KPI Dashboard Template - Blank Format</w:t>
+      </w:r>
+    </w:p>
+    <w:p>
+      <w:pPr>
+        <w:spacing w:line="360" w:lineRule="auto" w:after="160"/>
+        <w:jc w:val="both"/>
+      </w:pPr>
+      <w:r>
+        <w:rPr>
+          <w:rFonts w:ascii="Times New Roman" w:hAnsi="Times New Roman"/>
+          <w:b w:val="0"/>
+          <w:sz w:val="24"/>
+        </w:rPr>
+        <w:t>E1. Awareness KPIs - Branded search volume: Baseline ____ ; Current ____ ; Change ____ - Social reach: Baseline ____ ; Current ____ ; Change ____</w:t>
+      </w:r>
+    </w:p>
+    <w:p>
+      <w:pPr>
+        <w:spacing w:line="360" w:lineRule="auto" w:after="160"/>
+        <w:jc w:val="both"/>
+      </w:pPr>
+      <w:r>
+        <w:rPr>
+          <w:rFonts w:ascii="Times New Roman" w:hAnsi="Times New Roman"/>
+          <w:b w:val="0"/>
+          <w:sz w:val="24"/>
+        </w:rPr>
+        <w:t>E2. Conversion KPIs - Route-map or itinerary clicks: Baseline ____ ; Current ____ ; Change ____ - Tour inquiries mentioning Buddhist circuit: Baseline ____ ; Current ____ ; Change ____</w:t>
+      </w:r>
+    </w:p>
+    <w:p>
+      <w:pPr>
+        <w:spacing w:line="360" w:lineRule="auto" w:after="160"/>
+        <w:jc w:val="both"/>
+      </w:pPr>
+      <w:r>
+        <w:rPr>
+          <w:rFonts w:ascii="Times New Roman" w:hAnsi="Times New Roman"/>
+          <w:b w:val="0"/>
+          <w:sz w:val="24"/>
+        </w:rPr>
+        <w:t>E3. Experience KPIs - Visitor satisfaction average (1-5): Baseline ____ ; Current ____ ; Change ____ - Information clarity rating (1-5): Baseline ____ ; Current ____ ; Change ____</w:t>
+      </w:r>
+    </w:p>
+    <w:p>
+      <w:pPr>
+        <w:spacing w:line="360" w:lineRule="auto" w:after="160"/>
+        <w:jc w:val="both"/>
+      </w:pPr>
+      <w:r>
+        <w:rPr>
+          <w:rFonts w:ascii="Times New Roman" w:hAnsi="Times New Roman"/>
+          <w:b w:val="0"/>
+          <w:sz w:val="24"/>
+        </w:rPr>
+        <w:t>E4. Responsible Tourism KPIs - Reported etiquette non-compliance incidents: Baseline ____ ; Current ____ ; Change ____ - Litter or unmanaged crowding observations: Baseline ____ ; Current ____ ; Change ____</w:t>
+      </w:r>
+    </w:p>
+    <w:p>
+      <w:pPr>
+        <w:spacing w:line="360" w:lineRule="auto" w:after="160"/>
+        <w:jc w:val="both"/>
+      </w:pPr>
+      <w:r>
+        <w:rPr>
+          <w:rFonts w:ascii="Times New Roman" w:hAnsi="Times New Roman"/>
+          <w:b w:val="0"/>
+          <w:sz w:val="24"/>
+        </w:rPr>
+        <w:t>E5. Review block - Month reviewed: ____________________ - Key wins: ____________________ - Key bottlenecks: ____________________ - Actions for next cycle: ____________________</w:t>
       </w:r>
     </w:p>
     <w:sectPr>

</xml_diff>